<commit_message>
content: add approved NLP techniques (3 Perceptual Positions and Cartesian Coordinates) to Love and Divan Reels packages
</commit_message>
<xml_diff>
--- a/baza/исходник миникурса/REELS_СЦЕНАРИЙ_ДИВАН.docx
+++ b/baza/исходник миникурса/REELS_СЦЕНАРИЙ_ДИВАН.docx
@@ -29,7 +29,7 @@
           <w:color w:val="555555"/>
           <w:sz w:val="21"/>
         </w:rPr>
-        <w:t>Адаптация техники 4 вопросов под стиль Анатолия Фёдорова</w:t>
+        <w:t>Сценарий 4 вопросов + Выдача Квадрата Декарта в Direct</w:t>
         <w:br/>
         <w:t>Спикер: Федоров Анатолий Игоревич (Семейный психолог, гипнолог, проректор МАГиГ)</w:t>
       </w:r>
@@ -79,28 +79,7 @@
           <w:b/>
           <w:sz w:val="20"/>
         </w:rPr>
-        <w:t xml:space="preserve">Подача: </w:t>
-      </w:r>
-      <w:r>
-        <w:rPr>
-          <w:rFonts w:ascii="Calibri" w:hAnsi="Calibri"/>
-          <w:i w:val="0"/>
-          <w:sz w:val="20"/>
-        </w:rPr>
-        <w:t>Жёсткий, прямой, как разговор с другом, который застрял. Без разгона, без академизма. В лоб.</w:t>
-      </w:r>
-    </w:p>
-    <w:p>
-      <w:pPr>
-        <w:spacing w:after="80" w:line="276" w:lineRule="auto"/>
-      </w:pPr>
-      <w:r>
-        <w:rPr>
-          <w:rFonts w:ascii="Calibri" w:hAnsi="Calibri"/>
-          <w:b/>
-          <w:sz w:val="20"/>
-        </w:rPr>
-        <w:t xml:space="preserve">Оверлей (первые 3 сек): </w:t>
+        <w:t xml:space="preserve">Оверлей (3 сек): </w:t>
       </w:r>
       <w:r>
         <w:rPr>
@@ -121,7 +100,7 @@
           <w:b/>
           <w:sz w:val="20"/>
         </w:rPr>
-        <w:t xml:space="preserve">Музыка: </w:t>
+        <w:t xml:space="preserve">Кодовое слово: </w:t>
       </w:r>
       <w:r>
         <w:rPr>
@@ -129,7 +108,7 @@
           <w:i w:val="0"/>
           <w:sz w:val="20"/>
         </w:rPr>
-        <w:t>Lo-fi бит или тишина. Без слащавого пианино.</w:t>
+        <w:t>«ДЕЙСТВИЕ» (или «СИЛА»)</w:t>
       </w:r>
     </w:p>
     <w:p>
@@ -180,7 +159,10 @@
         <w:t>Если хоть на один из этих вопросов ты не можешь честно сказать «да» — вот он, твой тормоз. Не лень. Не прокрастинация. А конкретная дыра, которую ты прячешь за сериалом и диваном.</w:t>
         <w:br/>
         <w:br/>
-        <w:t>Найди её. И диван тебя отпустит.»</w:t>
+        <w:t>Найди её. И диван тебя отпустит.</w:t>
+        <w:br/>
+        <w:br/>
+        <w:t>Напиши слово ДЕЙСТВИЕ в комментарии — пришлю в директ инструкцию к Квадрату Декарта, которая достаёт скрытые выгоды лени и заставляет мозг двигаться.»</w:t>
       </w:r>
     </w:p>
     <w:p>
@@ -194,7 +176,7 @@
           <w:color w:val="1F4E5B"/>
           <w:sz w:val="26"/>
         </w:rPr>
-        <w:t>РЕЖИССЁРСКИЕ ЗАМЕТКИ</w:t>
+        <w:t>ТЕКСТ ДЛЯ ОТПРАВКИ В DIRECT ПО СЛОВУ «ДЕЙСТВИЕ»</w:t>
       </w:r>
     </w:p>
     <w:p>
@@ -207,13 +189,43 @@
           <w:i w:val="0"/>
           <w:sz w:val="20"/>
         </w:rPr>
-        <w:t>1. Первую фразу «Ты не ленивый. Ты просто врёшь себе» — сказать жёстко, с паузой после точки. Это удар.</w:t>
+        <w:t>Лень и прокрастинация — это не слабость характера. Мозг блокирует действия, когда цель чужая или когда внутри есть скрытый страх последствий.</w:t>
         <w:br/>
-        <w:t>2. 4 вопроса — считать на пальцах, загибая. Визуальный якорь.</w:t>
         <w:br/>
-        <w:t>3. «Конкретная дыра, которую ты прячешь за сериалом и диваном» — сказать спокойно, без осуждения. Как врач, который ставит диагноз.</w:t>
+        <w:t>ЧАСТЬ 1. ЭКСПРЕСС-ДИАГНОСТИКА (4 ВОПРОСА):</w:t>
         <w:br/>
-        <w:t>4. Финал «Найди её. И диван тебя отпустит» — с лёгкой паузой и кивком. Точка.</w:t>
+        <w:t>1. Зачем это лично мне? (В чём личный интерес?)</w:t>
+        <w:br/>
+        <w:t>2. Хватит ли ресурсов? (Или решил, что не потяну?)</w:t>
+        <w:br/>
+        <w:t>3. Кому станет лучше, если сделаю? (Ради кого из близких встать?)</w:t>
+        <w:br/>
+        <w:t>4. Что получу в сухом остатке? (Осязаемый результат)</w:t>
+        <w:br/>
+        <w:br/>
+        <w:t>ЧАСТЬ 2. ПРАКТИКА: КВАДРАТ ДЕКАРТА</w:t>
+        <w:br/>
+        <w:t>Разделите лист крестом на 4 сектора и ответьте ПИСЬМЕННО:</w:t>
+        <w:br/>
+        <w:br/>
+        <w:t>1. ЧТО БУДЕТ, если я это сделаю? (Плюсы от действия — ваша мотивация).</w:t>
+        <w:br/>
+        <w:t>2. ЧТО БУДЕТ, если я этого НЕ сделаю? (Плюсы ничего не менять — скрытые выгоды лени, которые держат на диване).</w:t>
+        <w:br/>
+        <w:t>3. ЧЕГО НЕ БУДЕТ, если я это сделаю? (Минусы от действия — цена решения: покой, свободное время).</w:t>
+        <w:br/>
+        <w:t>4. ЧЕГО НЕ БУДЕТ, если я этого НЕ сделаю? (Самый мощный сектор: чего вы гарантированно НИКОГДА в жизни не увидите, если останетесь лежать).</w:t>
+        <w:br/>
+        <w:br/>
+        <w:t>💡 Сравните Сектор 4 и Сектор 2. Когда вы увидите цену дивана — вопрос мотивации отпадёт сам собой.</w:t>
+        <w:br/>
+        <w:br/>
+        <w:t>Сделайте прямо сегодня один простой 2-минутный шаг.</w:t>
+        <w:br/>
+        <w:br/>
+        <w:t>👉 Разборы психологических блоков — в Telegram-канале «Простые вещи»:</w:t>
+        <w:br/>
+        <w:t>https://t.me/smplthing</w:t>
       </w:r>
     </w:p>
     <w:sectPr>

</xml_diff>